<commit_message>
Honoraroverslag: tilbud fra geotekniker og evt. energirådgiver
Co-Authored-By: Claude Opus 5.5 <noreply@anthropic.com>
Claude-Session: https://claude.ai/code/session_013ordoCcUEbJneMEHBU2jJd
</commit_message>
<xml_diff>
--- a/energi/projekter/hjerlesvej/tilbud/Honoraroverslag_Hjerlesvej.docx
+++ b/energi/projekter/hjerlesvej/tilbud/Honoraroverslag_Hjerlesvej.docx
@@ -506,6 +506,14 @@
       <w:pPr>
         <w:spacing w:line="240" w:lineRule="auto"/>
       </w:pPr>
+      <w:r>
+        <w:t xml:space="preserve">Selve den geotekniske undersøgelse (boringer og rapport) udføres af en geotekniker og er ikke indeholdt i vores honorar. Vi indhenter gerne tilbud på undersøgelsen. En geoteknisk undersøgelse af denne størrelse koster typisk omkring 10.000 kr. ekskl. moms.</w:t>
+      </w:r>
+    </w:p>
+    <w:p>
+      <w:pPr>
+        <w:spacing w:line="240" w:lineRule="auto"/>
+      </w:pPr>
     </w:p>
     <w:p>
       <w:pPr>
@@ -904,6 +912,14 @@
       <w:pPr>
         <w:spacing w:line="240" w:lineRule="auto"/>
       </w:pPr>
+      <w:r>
+        <w:t xml:space="preserve">Energidokumentationen og indeklimaberegningerne kan alternativt udføres af en energirådgiver. Ønskes det, indhenter vi tilbud, og vores honorar reduceres tilsvarende med 20–25 timer.</w:t>
+      </w:r>
+    </w:p>
+    <w:p>
+      <w:pPr>
+        <w:spacing w:line="240" w:lineRule="auto"/>
+      </w:pPr>
     </w:p>
     <w:p>
       <w:pPr>
@@ -989,6 +1005,14 @@
       <w:pPr>
         <w:spacing w:line="240" w:lineRule="auto"/>
       </w:pPr>
+      <w:r>
+        <w:t xml:space="preserve">Udføres energiramme og indeklima af ekstern energirådgiver, er vores honorar 235–310 timer, svarende til 235.000–310.000 kr. ekskl. moms. Hertil kommer geoteknisk undersøgelse, typisk ca. 10.000 kr. ekskl. moms.</w:t>
+      </w:r>
+    </w:p>
+    <w:p>
+      <w:pPr>
+        <w:spacing w:line="240" w:lineRule="auto"/>
+      </w:pPr>
     </w:p>
     <w:p>
       <w:pPr>
@@ -1016,7 +1040,7 @@
         <w:spacing w:before="0" w:after="0" w:line="276" w:lineRule="auto"/>
       </w:pPr>
       <w:r>
-        <w:t xml:space="preserve">Geoteknisk undersøgelse (boringer og rapport), som udføres af geotekniker</w:t>
+        <w:t xml:space="preserve">Geoteknisk undersøgelse (boringer og rapport), som udføres af geotekniker – typisk ca. 10.000 kr. ekskl. moms</w:t>
       </w:r>
     </w:p>
     <w:p>

</xml_diff>

<commit_message>
Honoraroverslag: energiramme og indeklima via indhentet tilbud
Co-Authored-By: Claude Opus 5.5 <noreply@anthropic.com>
Claude-Session: https://claude.ai/code/session_013ordoCcUEbJneMEHBU2jJd
</commit_message>
<xml_diff>
--- a/energi/projekter/hjerlesvej/tilbud/Honoraroverslag_Hjerlesvej.docx
+++ b/energi/projekter/hjerlesvej/tilbud/Honoraroverslag_Hjerlesvej.docx
@@ -381,15 +381,15 @@
           <w:b/>
           <w:bCs/>
         </w:rPr>
-        <w:t xml:space="preserve">Honoraroverslag – konstruktioner og energi:</w:t>
-      </w:r>
-    </w:p>
-    <w:p>
-      <w:pPr>
-        <w:spacing w:line="240" w:lineRule="auto"/>
-      </w:pPr>
-      <w:r>
-        <w:t xml:space="preserve">Honoraroverslaget omfatter de konstruktive ydelser og energidokumentationen i forbindelse med ombygning og tilbygning af sommerhuset på Hjerlesvej 17. Projektet forbinder det eksisterende A-hus fra 1973 og annekset fra 2001 med en ny bygning. Projektet indplaceres i konstruktionsklasse KK1 og konsekvensklasse CC2, og der kræves derfor ikke certificering.</w:t>
+        <w:t xml:space="preserve">Honoraroverslag – konstruktioner:</w:t>
+      </w:r>
+    </w:p>
+    <w:p>
+      <w:pPr>
+        <w:spacing w:line="240" w:lineRule="auto"/>
+      </w:pPr>
+      <w:r>
+        <w:t xml:space="preserve">Honoraroverslaget omfatter de konstruktive ydelser i forbindelse med ombygning og tilbygning af sommerhuset på Hjerlesvej 17. Projektet forbinder det eksisterende A-hus fra 1973 og annekset fra 2001 med en ny bygning. Projektet indplaceres i konstruktionsklasse KK1 og konsekvensklasse CC2, og der kræves derfor ikke certificering.</w:t>
       </w:r>
     </w:p>
     <w:p>
@@ -829,7 +829,7 @@
           <w:b/>
           <w:bCs/>
         </w:rPr>
-        <w:t xml:space="preserve">4. Energiramme og indeklima (20–25 timer)</w:t>
+        <w:t xml:space="preserve">4. Energiramme og indeklima (tilbud indhentes)</w:t>
       </w:r>
     </w:p>
     <w:p>
@@ -854,6 +854,14 @@
       </w:pPr>
       <w:r>
         <w:t xml:space="preserve">Termisk indeklima (§ 386) og dagslys (§ 379) gælder også for sommerhuse. Overophedning i rummene bag de sydvestvendte glaspartier vurderes som projektets største risiko og dokumenteres ved beregning i de kritiske rum. Klimapåvirkning (LCA) forventes ikke krævet, da tilbygninger under 250 m² til sommerhuse er undtaget (§ 297, stk. 3).</w:t>
+      </w:r>
+    </w:p>
+    <w:p>
+      <w:pPr>
+        <w:spacing w:line="240" w:lineRule="auto"/>
+      </w:pPr>
+      <w:r>
+        <w:t xml:space="preserve">Vi indhenter tilbud fra en energirådgiver på energiramme og vurdering af indeklima. Tilbuddet forventes at omfatte:</w:t>
       </w:r>
     </w:p>
     <w:p>
@@ -913,7 +921,7 @@
         <w:spacing w:line="240" w:lineRule="auto"/>
       </w:pPr>
       <w:r>
-        <w:t xml:space="preserve">Energidokumentationen og indeklimaberegningerne kan alternativt udføres af en energirådgiver. Ønskes det, indhenter vi tilbud, og vores honorar reduceres tilsvarende med 20–25 timer.</w:t>
+        <w:t xml:space="preserve">Vi koordinerer med energirådgiveren, så konstruktioner, glaspartier og solafskærmning hænger sammen med energidokumentationen.</w:t>
       </w:r>
     </w:p>
     <w:p>
@@ -978,6 +986,47 @@
     </w:p>
     <w:p>
       <w:pPr>
+        <w:spacing w:line="240" w:lineRule="auto"/>
+      </w:pPr>
+      <w:r>
+        <w:rPr>
+          <w:b/>
+          <w:bCs/>
+        </w:rPr>
+        <w:t xml:space="preserve">I alt 235–310 timer, svarende til 235.000–310.000 kr. ekskl. moms.</w:t>
+      </w:r>
+    </w:p>
+    <w:p>
+      <w:pPr>
+        <w:spacing w:line="240" w:lineRule="auto"/>
+      </w:pPr>
+      <w:r>
+        <w:t xml:space="preserve">Hertil kommer geoteknisk undersøgelse, typisk ca. 10.000 kr. ekskl. moms, samt energiramme og vurdering af indeklima efter indhentet tilbud.</w:t>
+      </w:r>
+    </w:p>
+    <w:p>
+      <w:pPr>
+        <w:spacing w:line="240" w:lineRule="auto"/>
+      </w:pPr>
+    </w:p>
+    <w:p>
+      <w:pPr>
+        <w:spacing w:line="240" w:lineRule="auto"/>
+        <w:rPr>
+          <w:b/>
+          <w:bCs/>
+        </w:rPr>
+      </w:pPr>
+      <w:r>
+        <w:rPr>
+          <w:b/>
+          <w:bCs/>
+        </w:rPr>
+        <w:t xml:space="preserve">Ikke inkluderet:</w:t>
+      </w:r>
+    </w:p>
+    <w:p>
+      <w:pPr>
         <w:pStyle w:val="Listeafsnit"/>
         <w:numPr>
           <w:ilvl w:val="0"/>
@@ -986,48 +1035,7 @@
         <w:spacing w:before="0" w:after="0" w:line="276" w:lineRule="auto"/>
       </w:pPr>
       <w:r>
-        <w:t xml:space="preserve">Energiramme og indeklima: 20–25 timer</w:t>
-      </w:r>
-    </w:p>
-    <w:p>
-      <w:pPr>
-        <w:spacing w:line="240" w:lineRule="auto"/>
-      </w:pPr>
-      <w:r>
-        <w:rPr>
-          <w:b/>
-          <w:bCs/>
-        </w:rPr>
-        <w:t xml:space="preserve">I alt 255–335 timer, svarende til 255.000–335.000 kr. ekskl. moms.</w:t>
-      </w:r>
-    </w:p>
-    <w:p>
-      <w:pPr>
-        <w:spacing w:line="240" w:lineRule="auto"/>
-      </w:pPr>
-      <w:r>
-        <w:t xml:space="preserve">Udføres energiramme og indeklima af ekstern energirådgiver, er vores honorar 235–310 timer, svarende til 235.000–310.000 kr. ekskl. moms. Hertil kommer geoteknisk undersøgelse, typisk ca. 10.000 kr. ekskl. moms.</w:t>
-      </w:r>
-    </w:p>
-    <w:p>
-      <w:pPr>
-        <w:spacing w:line="240" w:lineRule="auto"/>
-      </w:pPr>
-    </w:p>
-    <w:p>
-      <w:pPr>
-        <w:spacing w:line="240" w:lineRule="auto"/>
-        <w:rPr>
-          <w:b/>
-          <w:bCs/>
-        </w:rPr>
-      </w:pPr>
-      <w:r>
-        <w:rPr>
-          <w:b/>
-          <w:bCs/>
-        </w:rPr>
-        <w:t xml:space="preserve">Ikke inkluderet:</w:t>
+        <w:t xml:space="preserve">Geoteknisk undersøgelse (boringer og rapport), som udføres af geotekniker – typisk ca. 10.000 kr. ekskl. moms</w:t>
       </w:r>
     </w:p>
     <w:p>
@@ -1040,7 +1048,7 @@
         <w:spacing w:before="0" w:after="0" w:line="276" w:lineRule="auto"/>
       </w:pPr>
       <w:r>
-        <w:t xml:space="preserve">Geoteknisk undersøgelse (boringer og rapport), som udføres af geotekniker – typisk ca. 10.000 kr. ekskl. moms</w:t>
+        <w:t xml:space="preserve">Energiramme og vurdering af indeklima – tilbud indhentes fra energirådgiver</w:t>
       </w:r>
     </w:p>
     <w:p>

</xml_diff>

<commit_message>
Honoraroverslag opdelt efter faser: forundersøgelser, projektforslag, statisk dokumentation, udførelsesprojekt, koordinering; tilvalg for energi, indeklima og installationer
Co-Authored-By: Claude Opus 5.5 <noreply@anthropic.com>
Claude-Session: https://claude.ai/code/session_013ordoCcUEbJneMEHBU2jJd
</commit_message>
<xml_diff>
--- a/energi/projekter/hjerlesvej/tilbud/Honoraroverslag_Hjerlesvej.docx
+++ b/energi/projekter/hjerlesvej/tilbud/Honoraroverslag_Hjerlesvej.docx
@@ -397,7 +397,7 @@
         <w:spacing w:line="240" w:lineRule="auto"/>
       </w:pPr>
       <w:r>
-        <w:t xml:space="preserve">Overslaget er et tidligt overslag baseret på arkitektens tegninger (WE Architecture, 28.09.2026) og byggesagsarkivet for A-huset og annekset. Der er endnu ikke foretaget besigtigelse eller geoteknisk undersøgelse, og overslaget er derfor angivet som en ramme. Arbejdet afregnes i medgået tid inden for rammen med en timepris på 1.000 kr. ekskl. moms.</w:t>
+        <w:t xml:space="preserve">Overslaget er et tidligt overslag baseret på arkitektens tegninger (WE Architecture, 28.09.2026) og byggesagsarkivet for A-huset og annekset. Der er endnu ikke foretaget besigtigelse eller geoteknisk undersøgelse, og overslaget er derfor angivet som en ramme. Arbejdet afregnes i medgået tid inden for rammen med en timepris på 1.000 kr. ekskl. moms. Ydelserne er opdelt efter projektets faser.</w:t>
       </w:r>
     </w:p>
     <w:p>
@@ -418,15 +418,15 @@
           <w:b/>
           <w:bCs/>
         </w:rPr>
-        <w:t xml:space="preserve">1. Geoteknik og fundering (35–50 timer)</w:t>
-      </w:r>
-    </w:p>
-    <w:p>
-      <w:pPr>
-        <w:spacing w:line="240" w:lineRule="auto"/>
-      </w:pPr>
-      <w:r>
-        <w:t xml:space="preserve">Der er sætningsskader på den eksisterende bygning, og de skal forstås og udbedres, før der kan funderes nyt. Funderingen af den nye bygning skal samtidig fastlægges, så nye og eksisterende fundamenter kan arbejde sammen uden nye sætninger.</w:t>
+        <w:t xml:space="preserve">1. Forundersøgelser – geoteknik og eksisterende konstruktioner (35–50 timer)</w:t>
+      </w:r>
+    </w:p>
+    <w:p>
+      <w:pPr>
+        <w:spacing w:line="240" w:lineRule="auto"/>
+      </w:pPr>
+      <w:r>
+        <w:t xml:space="preserve">Der er sætningsskader på den eksisterende bygning, og A-huset fra 1973 har ingen statiske beregninger i byggesagsarkivet. Før der kan projekteres, skal skaderne forstås, og de eksisterende konstruktioners bæreevne fastlægges.</w:t>
       </w:r>
     </w:p>
     <w:p>
@@ -439,7 +439,7 @@
         <w:spacing w:before="0" w:after="0" w:line="276" w:lineRule="auto"/>
       </w:pPr>
       <w:r>
-        <w:t xml:space="preserve">Besigtigelse og registrering af sætningsskader</w:t>
+        <w:t xml:space="preserve">Arkivsøgning og gennemgang af tegninger for A-hus (1973) og anneks (2001)</w:t>
       </w:r>
     </w:p>
     <w:p>
@@ -452,7 +452,7 @@
         <w:spacing w:before="0" w:after="0" w:line="276" w:lineRule="auto"/>
       </w:pPr>
       <w:r>
-        <w:t xml:space="preserve">Vurdering af sætningsskadernes årsag og omfang</w:t>
+        <w:t xml:space="preserve">Besigtigelse og registrering af sætningsskader og eksisterende konstruktioner</w:t>
       </w:r>
     </w:p>
     <w:p>
@@ -465,7 +465,7 @@
         <w:spacing w:before="0" w:after="0" w:line="276" w:lineRule="auto"/>
       </w:pPr>
       <w:r>
-        <w:t xml:space="preserve">Boreplan, koordinering af geoteknisk undersøgelse og gennemgang af rapport</w:t>
+        <w:t xml:space="preserve">Vurdering af sætningsskadernes årsag og omfang</w:t>
       </w:r>
     </w:p>
     <w:p>
@@ -478,7 +478,7 @@
         <w:spacing w:before="0" w:after="0" w:line="276" w:lineRule="auto"/>
       </w:pPr>
       <w:r>
-        <w:t xml:space="preserve">Funderingsløsninger til udbedring af sætninger</w:t>
+        <w:t xml:space="preserve">Boreplan, koordinering af geoteknisk undersøgelse og gennemgang af rapport</w:t>
       </w:r>
     </w:p>
     <w:p>
@@ -491,23 +491,15 @@
         <w:spacing w:before="0" w:after="0" w:line="276" w:lineRule="auto"/>
       </w:pPr>
       <w:r>
-        <w:t xml:space="preserve">Funderingsløsning for ny bygning og tilslutning til eksisterende fundamenter</w:t>
-      </w:r>
-    </w:p>
-    <w:p>
-      <w:pPr>
-        <w:spacing w:line="240" w:lineRule="auto"/>
-      </w:pPr>
-      <w:r>
-        <w:t xml:space="preserve">Viser undersøgelsen fast bund i normal dybde, forventes den lave ende af rammen. Kræver jorden dybere eller særlig fundering, forventes den høje ende.</w:t>
-      </w:r>
-    </w:p>
-    <w:p>
-      <w:pPr>
-        <w:spacing w:line="240" w:lineRule="auto"/>
-      </w:pPr>
-      <w:r>
-        <w:t xml:space="preserve">Selve den geotekniske undersøgelse (boringer og rapport) udføres af en geotekniker og er ikke indeholdt i vores honorar. Vi indhenter gerne tilbud på undersøgelsen. En geoteknisk undersøgelse af denne størrelse koster typisk omkring 10.000 kr. ekskl. moms.</w:t>
+        <w:t xml:space="preserve">Vurdering af A-husets lamintræskonstruktion og annekset som grundlag for projektet</w:t>
+      </w:r>
+    </w:p>
+    <w:p>
+      <w:pPr>
+        <w:spacing w:line="240" w:lineRule="auto"/>
+      </w:pPr>
+      <w:r>
+        <w:t xml:space="preserve">Selve den geotekniske undersøgelse (boringer og rapport) udføres af en geotekniker og er ikke indeholdt i vores honorar. Vi indhenter gerne tilbud på undersøgelsen, som typisk koster omkring 10.000 kr. ekskl. moms.</w:t>
       </w:r>
     </w:p>
     <w:p>
@@ -528,22 +520,15 @@
           <w:b/>
           <w:bCs/>
         </w:rPr>
-        <w:t xml:space="preserve">2. Transformation – anneks og A-frame (95–135 timer)</w:t>
-      </w:r>
-    </w:p>
-    <w:p>
-      <w:pPr>
-        <w:spacing w:line="240" w:lineRule="auto"/>
-      </w:pPr>
-      <w:r>
-        <w:rPr>
-          <w:b/>
-          <w:bCs/>
-        </w:rPr>
-        <w:t xml:space="preserve">Anneks (30–45 timer).</w:t>
-      </w:r>
-      <w:r>
-        <w:t xml:space="preserve"> Annekset fra 2001 er godt dokumenteret, men får ændrede vægge, nye åbninger og en tilkobling til den nye bygning.</w:t>
+        <w:t xml:space="preserve">2. Projektforslag (50–65 timer)</w:t>
+      </w:r>
+    </w:p>
+    <w:p>
+      <w:pPr>
+        <w:spacing w:line="240" w:lineRule="auto"/>
+      </w:pPr>
+      <w:r>
+        <w:t xml:space="preserve">I projektforslaget fastlægges de konstruktive principper i dialog med arkitekten, så arkitekturen kan fastholdes inden for en realistisk konstruktion.</w:t>
       </w:r>
     </w:p>
     <w:p>
@@ -556,7 +541,7 @@
         <w:spacing w:before="0" w:after="0" w:line="276" w:lineRule="auto"/>
       </w:pPr>
       <w:r>
-        <w:t xml:space="preserve">Registrering af eksisterende konstruktion ud fra tegninger fra 2001 og besigtigelse</w:t>
+        <w:t xml:space="preserve">Funderingsløsninger til udbedring af sætninger og fundering af ny bygning</w:t>
       </w:r>
     </w:p>
     <w:p>
@@ -569,7 +554,7 @@
         <w:spacing w:before="0" w:after="0" w:line="276" w:lineRule="auto"/>
       </w:pPr>
       <w:r>
-        <w:t xml:space="preserve">Stabilitet ved ændrede vægge og sammenkobling med ny bygning</w:t>
+        <w:t xml:space="preserve">Statisk system og stabilitet for ny bygning</w:t>
       </w:r>
     </w:p>
     <w:p>
@@ -582,7 +567,7 @@
         <w:spacing w:before="0" w:after="0" w:line="276" w:lineRule="auto"/>
       </w:pPr>
       <w:r>
-        <w:t xml:space="preserve">Bjælker og søjler ved nye laster og åbninger</w:t>
+        <w:t xml:space="preserve">Anneks: principper for stabilitet, bjælker, søjler og nye åbninger</w:t>
       </w:r>
     </w:p>
     <w:p>
@@ -595,22 +580,7 @@
         <w:spacing w:before="0" w:after="0" w:line="276" w:lineRule="auto"/>
       </w:pPr>
       <w:r>
-        <w:t xml:space="preserve">Deformationer, så bevægelser holdes inden for, hvad facader og samlinger kan optage</w:t>
-      </w:r>
-    </w:p>
-    <w:p>
-      <w:pPr>
-        <w:spacing w:line="240" w:lineRule="auto"/>
-      </w:pPr>
-      <w:r>
-        <w:rPr>
-          <w:b/>
-          <w:bCs/>
-        </w:rPr>
-        <w:t xml:space="preserve">A-frame (65–90 timer).</w:t>
-      </w:r>
-      <w:r>
-        <w:t xml:space="preserve"> A-huset fra 1973 er opført i lamintræ med dobbelte skrå spær og hanebånd. Der findes ingen statiske beregninger i byggesagsarkivet, og konstruktionen skal derfor vurderes fra bunden.</w:t>
+        <w:t xml:space="preserve">A-frame: deformationer ved nye glaspartier og konsekvens af det dobbelthøje rum</w:t>
       </w:r>
     </w:p>
     <w:p>
@@ -623,7 +593,7 @@
         <w:spacing w:before="0" w:after="0" w:line="276" w:lineRule="auto"/>
       </w:pPr>
       <w:r>
-        <w:t xml:space="preserve">Vurdering af deformationer ved nye glaspartier, da store glasflader kun tåler små bevægelser</w:t>
+        <w:t xml:space="preserve">Åbning ved køkken, buede bjælker og flytning af glasfacader</w:t>
       </w:r>
     </w:p>
     <w:p>
@@ -636,7 +606,36 @@
         <w:spacing w:before="0" w:after="0" w:line="276" w:lineRule="auto"/>
       </w:pPr>
       <w:r>
-        <w:t xml:space="preserve">Vurdering ved nye laster og det dobbelthøje rum, hvor etagedæk og hanebånd delvist fjernes</w:t>
+        <w:t xml:space="preserve">Overslagsberegninger og principtegninger</w:t>
+      </w:r>
+    </w:p>
+    <w:p>
+      <w:pPr>
+        <w:spacing w:line="240" w:lineRule="auto"/>
+      </w:pPr>
+    </w:p>
+    <w:p>
+      <w:pPr>
+        <w:spacing w:line="240" w:lineRule="auto"/>
+        <w:rPr>
+          <w:b/>
+          <w:bCs/>
+        </w:rPr>
+      </w:pPr>
+      <w:r>
+        <w:rPr>
+          <w:b/>
+          <w:bCs/>
+        </w:rPr>
+        <w:t xml:space="preserve">3. Statisk dokumentation (70–95 timer)</w:t>
+      </w:r>
+    </w:p>
+    <w:p>
+      <w:pPr>
+        <w:spacing w:line="240" w:lineRule="auto"/>
+      </w:pPr>
+      <w:r>
+        <w:t xml:space="preserve">Den statiske dokumentation udarbejdes til myndighedsprojektet og omfatter eftervisning af alle bærende konstruktioner i de tre bygningsdele.</w:t>
       </w:r>
     </w:p>
     <w:p>
@@ -649,7 +648,7 @@
         <w:spacing w:before="0" w:after="0" w:line="276" w:lineRule="auto"/>
       </w:pPr>
       <w:r>
-        <w:t xml:space="preserve">Åbning ved køkken og buede bjælker</w:t>
+        <w:t xml:space="preserve">A1 Konstruktionsgrundlag</w:t>
       </w:r>
     </w:p>
     <w:p>
@@ -662,7 +661,7 @@
         <w:spacing w:before="0" w:after="0" w:line="276" w:lineRule="auto"/>
       </w:pPr>
       <w:r>
-        <w:t xml:space="preserve">Flytning af glasfacader og den ændrede afstivning</w:t>
+        <w:t xml:space="preserve">A2 Statiske beregninger: laster inkl. vind på den kystnære grund og snesæk mod A-husets tag</w:t>
       </w:r>
     </w:p>
     <w:p>
@@ -675,7 +674,7 @@
         <w:spacing w:before="0" w:after="0" w:line="276" w:lineRule="auto"/>
       </w:pPr>
       <w:r>
-        <w:t xml:space="preserve">Samling mellem anneks, ny bygning og A-frame</w:t>
+        <w:t xml:space="preserve">Fundering, bjælker, søjler, vægge og stabilitet for ny bygning</w:t>
       </w:r>
     </w:p>
     <w:p>
@@ -688,36 +687,7 @@
         <w:spacing w:before="0" w:after="0" w:line="276" w:lineRule="auto"/>
       </w:pPr>
       <w:r>
-        <w:t xml:space="preserve">Beregning af trappe og repos</w:t>
-      </w:r>
-    </w:p>
-    <w:p>
-      <w:pPr>
-        <w:spacing w:line="240" w:lineRule="auto"/>
-      </w:pPr>
-    </w:p>
-    <w:p>
-      <w:pPr>
-        <w:spacing w:line="240" w:lineRule="auto"/>
-        <w:rPr>
-          <w:b/>
-          <w:bCs/>
-        </w:rPr>
-      </w:pPr>
-      <w:r>
-        <w:rPr>
-          <w:b/>
-          <w:bCs/>
-        </w:rPr>
-        <w:t xml:space="preserve">3. Nybyg (105–125 timer)</w:t>
-      </w:r>
-    </w:p>
-    <w:p>
-      <w:pPr>
-        <w:spacing w:line="240" w:lineRule="auto"/>
-      </w:pPr>
-      <w:r>
-        <w:t xml:space="preserve">Den nye bygning projekteres fuldt. Lasterne omfatter vind på den kystnære grund og sne med snesæk mod A-husets skrå tag og ved ovenlyslanternerne.</w:t>
+        <w:t xml:space="preserve">Anneks: stabilitet, bjælker, søjler og deformationer</w:t>
       </w:r>
     </w:p>
     <w:p>
@@ -730,7 +700,7 @@
         <w:spacing w:before="0" w:after="0" w:line="276" w:lineRule="auto"/>
       </w:pPr>
       <w:r>
-        <w:t xml:space="preserve">Lastopgørelse</w:t>
+        <w:t xml:space="preserve">A-frame: bæreevne og deformationer ved nye laster og glaspartier, buede bjælker</w:t>
       </w:r>
     </w:p>
     <w:p>
@@ -743,7 +713,7 @@
         <w:spacing w:before="0" w:after="0" w:line="276" w:lineRule="auto"/>
       </w:pPr>
       <w:r>
-        <w:t xml:space="preserve">Fundering</w:t>
+        <w:t xml:space="preserve">Trappe og repos</w:t>
       </w:r>
     </w:p>
     <w:p>
@@ -756,7 +726,28 @@
         <w:spacing w:before="0" w:after="0" w:line="276" w:lineRule="auto"/>
       </w:pPr>
       <w:r>
-        <w:t xml:space="preserve">Bjælker og søjler</w:t>
+        <w:t xml:space="preserve">B1 Statisk projektredegørelse</w:t>
+      </w:r>
+    </w:p>
+    <w:p>
+      <w:pPr>
+        <w:spacing w:line="240" w:lineRule="auto"/>
+      </w:pPr>
+    </w:p>
+    <w:p>
+      <w:pPr>
+        <w:spacing w:line="240" w:lineRule="auto"/>
+        <w:rPr>
+          <w:b/>
+          <w:bCs/>
+        </w:rPr>
+      </w:pPr>
+      <w:r>
+        <w:rPr>
+          <w:b/>
+          <w:bCs/>
+        </w:rPr>
+        <w:t xml:space="preserve">4. Udførelsesprojekt (45–60 timer)</w:t>
       </w:r>
     </w:p>
     <w:p>
@@ -769,7 +760,7 @@
         <w:spacing w:before="0" w:after="0" w:line="276" w:lineRule="auto"/>
       </w:pPr>
       <w:r>
-        <w:t xml:space="preserve">Vægge og stabilitet (vindafstivning og skiver)</w:t>
+        <w:t xml:space="preserve">Konstruktionstegninger: fundamentsplan, planer og snit</w:t>
       </w:r>
     </w:p>
     <w:p>
@@ -782,7 +773,7 @@
         <w:spacing w:before="0" w:after="0" w:line="276" w:lineRule="auto"/>
       </w:pPr>
       <w:r>
-        <w:t xml:space="preserve">Konstruktionstegninger (planer, snit og principdetaljer)</w:t>
+        <w:t xml:space="preserve">Detaljer for samlinger mellem anneks, ny bygning og A-frame</w:t>
       </w:r>
     </w:p>
     <w:p>
@@ -795,7 +786,7 @@
         <w:spacing w:before="0" w:after="0" w:line="276" w:lineRule="auto"/>
       </w:pPr>
       <w:r>
-        <w:t xml:space="preserve">Statisk dokumentation: A1 Konstruktionsgrundlag, A2 Statiske beregninger og B1 Statisk projektredegørelse</w:t>
+        <w:t xml:space="preserve">Detaljer for udbedring af fundamenter</w:t>
       </w:r>
     </w:p>
     <w:p>
@@ -808,7 +799,7 @@
         <w:spacing w:before="0" w:after="0" w:line="276" w:lineRule="auto"/>
       </w:pPr>
       <w:r>
-        <w:t xml:space="preserve">Møder og koordinering med arkitekt og entreprenør</w:t>
+        <w:t xml:space="preserve">Detaljer for trappe, repos og buede bjælker</w:t>
       </w:r>
     </w:p>
     <w:p>
@@ -829,39 +820,7 @@
           <w:b/>
           <w:bCs/>
         </w:rPr>
-        <w:t xml:space="preserve">4. Energiramme og indeklima (tilbud indhentes)</w:t>
-      </w:r>
-    </w:p>
-    <w:p>
-      <w:pPr>
-        <w:spacing w:line="240" w:lineRule="auto"/>
-      </w:pPr>
-      <w:r>
-        <w:t xml:space="preserve">Huset er og forbliver et sommerhus. Sommerhuse og tilbygninger hertil er efter BR18 § 283, stk. 2 ikke omfattet af energirammen, tæthedskravet eller kravet til dimensionerende transmissionstab. I stedet skal klimaskærmen opfylde U-værdier og linjetab i bilag 2, tabel 4, og vinduer og glaspartier må højst udgøre 30 % af det opvarmede etageareal (§ 284).</w:t>
-      </w:r>
-    </w:p>
-    <w:p>
-      <w:pPr>
-        <w:spacing w:line="240" w:lineRule="auto"/>
-      </w:pPr>
-      <w:r>
-        <w:t xml:space="preserve">Med projektets store glaspartier forventes 30 %-grænsen overskredet. Dokumentationen sker derfor med en varmetabsramme efter DS 418, hvor det samlede varmetab ikke må blive større, end hvis tabel 4-værdierne var overholdt. For ændringer i de eksisterende bygninger gælder tabel 4-kravene, hvor de er rentable (§ 285).</w:t>
-      </w:r>
-    </w:p>
-    <w:p>
-      <w:pPr>
-        <w:spacing w:line="240" w:lineRule="auto"/>
-      </w:pPr>
-      <w:r>
-        <w:t xml:space="preserve">Termisk indeklima (§ 386) og dagslys (§ 379) gælder også for sommerhuse. Overophedning i rummene bag de sydvestvendte glaspartier vurderes som projektets største risiko og dokumenteres ved beregning i de kritiske rum. Klimapåvirkning (LCA) forventes ikke krævet, da tilbygninger under 250 m² til sommerhuse er undtaget (§ 297, stk. 3).</w:t>
-      </w:r>
-    </w:p>
-    <w:p>
-      <w:pPr>
-        <w:spacing w:line="240" w:lineRule="auto"/>
-      </w:pPr>
-      <w:r>
-        <w:t xml:space="preserve">Vi indhenter tilbud fra en energirådgiver på energiramme og vurdering af indeklima. Tilbuddet forventes at omfatte:</w:t>
+        <w:t xml:space="preserve">5. Løbende koordinering og møder (20–30 timer)</w:t>
       </w:r>
     </w:p>
     <w:p>
@@ -874,7 +833,7 @@
         <w:spacing w:before="0" w:after="0" w:line="276" w:lineRule="auto"/>
       </w:pPr>
       <w:r>
-        <w:t xml:space="preserve">Eftervisning af U-værdier og linjetab samt varmetabsramme efter DS 418</w:t>
+        <w:t xml:space="preserve">Projekteringsmøder og koordinering med arkitekt</w:t>
       </w:r>
     </w:p>
     <w:p>
@@ -887,7 +846,7 @@
         <w:spacing w:before="0" w:after="0" w:line="276" w:lineRule="auto"/>
       </w:pPr>
       <w:r>
-        <w:t xml:space="preserve">Termisk indeklima i de kritiske rum (DRY 2013) med forslag til solafskærmning og udluftning</w:t>
+        <w:t xml:space="preserve">Koordinering med entreprenør og besvarelse af spørgsmål under udførelsen</w:t>
       </w:r>
     </w:p>
     <w:p>
@@ -900,7 +859,28 @@
         <w:spacing w:before="0" w:after="0" w:line="276" w:lineRule="auto"/>
       </w:pPr>
       <w:r>
-        <w:t xml:space="preserve">Dagslys efter § 379</w:t>
+        <w:t xml:space="preserve">Opdatering af dokumentation ved mindre projektændringer</w:t>
+      </w:r>
+    </w:p>
+    <w:p>
+      <w:pPr>
+        <w:spacing w:line="240" w:lineRule="auto"/>
+      </w:pPr>
+    </w:p>
+    <w:p>
+      <w:pPr>
+        <w:spacing w:line="240" w:lineRule="auto"/>
+        <w:rPr>
+          <w:b/>
+          <w:bCs/>
+        </w:rPr>
+      </w:pPr>
+      <w:r>
+        <w:rPr>
+          <w:b/>
+          <w:bCs/>
+        </w:rPr>
+        <w:t xml:space="preserve">Samlet honoraroverslag:</w:t>
       </w:r>
     </w:p>
     <w:p>
@@ -913,36 +893,7 @@
         <w:spacing w:before="0" w:after="0" w:line="276" w:lineRule="auto"/>
       </w:pPr>
       <w:r>
-        <w:t xml:space="preserve">Notat til myndighederne</w:t>
-      </w:r>
-    </w:p>
-    <w:p>
-      <w:pPr>
-        <w:spacing w:line="240" w:lineRule="auto"/>
-      </w:pPr>
-      <w:r>
-        <w:t xml:space="preserve">Vi koordinerer med energirådgiveren, så konstruktioner, glaspartier og solafskærmning hænger sammen med energidokumentationen.</w:t>
-      </w:r>
-    </w:p>
-    <w:p>
-      <w:pPr>
-        <w:spacing w:line="240" w:lineRule="auto"/>
-      </w:pPr>
-    </w:p>
-    <w:p>
-      <w:pPr>
-        <w:spacing w:line="240" w:lineRule="auto"/>
-        <w:rPr>
-          <w:b/>
-          <w:bCs/>
-        </w:rPr>
-      </w:pPr>
-      <w:r>
-        <w:rPr>
-          <w:b/>
-          <w:bCs/>
-        </w:rPr>
-        <w:t xml:space="preserve">Samlet honoraroverslag:</w:t>
+        <w:t xml:space="preserve">1. Forundersøgelser: 35–50 timer</w:t>
       </w:r>
     </w:p>
     <w:p>
@@ -955,7 +906,7 @@
         <w:spacing w:before="0" w:after="0" w:line="276" w:lineRule="auto"/>
       </w:pPr>
       <w:r>
-        <w:t xml:space="preserve">Geoteknik og fundering: 35–50 timer</w:t>
+        <w:t xml:space="preserve">2. Projektforslag: 50–65 timer</w:t>
       </w:r>
     </w:p>
     <w:p>
@@ -968,7 +919,7 @@
         <w:spacing w:before="0" w:after="0" w:line="276" w:lineRule="auto"/>
       </w:pPr>
       <w:r>
-        <w:t xml:space="preserve">Transformation – anneks og A-frame: 95–135 timer</w:t>
+        <w:t xml:space="preserve">3. Statisk dokumentation: 70–95 timer</w:t>
       </w:r>
     </w:p>
     <w:p>
@@ -981,48 +932,7 @@
         <w:spacing w:before="0" w:after="0" w:line="276" w:lineRule="auto"/>
       </w:pPr>
       <w:r>
-        <w:t xml:space="preserve">Nybyg: 105–125 timer</w:t>
-      </w:r>
-    </w:p>
-    <w:p>
-      <w:pPr>
-        <w:spacing w:line="240" w:lineRule="auto"/>
-      </w:pPr>
-      <w:r>
-        <w:rPr>
-          <w:b/>
-          <w:bCs/>
-        </w:rPr>
-        <w:t xml:space="preserve">I alt 235–310 timer, svarende til 235.000–310.000 kr. ekskl. moms.</w:t>
-      </w:r>
-    </w:p>
-    <w:p>
-      <w:pPr>
-        <w:spacing w:line="240" w:lineRule="auto"/>
-      </w:pPr>
-      <w:r>
-        <w:t xml:space="preserve">Hertil kommer geoteknisk undersøgelse, typisk ca. 10.000 kr. ekskl. moms, samt energiramme og vurdering af indeklima efter indhentet tilbud.</w:t>
-      </w:r>
-    </w:p>
-    <w:p>
-      <w:pPr>
-        <w:spacing w:line="240" w:lineRule="auto"/>
-      </w:pPr>
-    </w:p>
-    <w:p>
-      <w:pPr>
-        <w:spacing w:line="240" w:lineRule="auto"/>
-        <w:rPr>
-          <w:b/>
-          <w:bCs/>
-        </w:rPr>
-      </w:pPr>
-      <w:r>
-        <w:rPr>
-          <w:b/>
-          <w:bCs/>
-        </w:rPr>
-        <w:t xml:space="preserve">Ikke inkluderet:</w:t>
+        <w:t xml:space="preserve">4. Udførelsesprojekt: 45–60 timer</w:t>
       </w:r>
     </w:p>
     <w:p>
@@ -1035,7 +945,122 @@
         <w:spacing w:before="0" w:after="0" w:line="276" w:lineRule="auto"/>
       </w:pPr>
       <w:r>
-        <w:t xml:space="preserve">Geoteknisk undersøgelse (boringer og rapport), som udføres af geotekniker – typisk ca. 10.000 kr. ekskl. moms</w:t>
+        <w:t xml:space="preserve">5. Løbende koordinering og møder: 20–30 timer</w:t>
+      </w:r>
+    </w:p>
+    <w:p>
+      <w:pPr>
+        <w:spacing w:line="240" w:lineRule="auto"/>
+      </w:pPr>
+      <w:r>
+        <w:rPr>
+          <w:b/>
+          <w:bCs/>
+        </w:rPr>
+        <w:t xml:space="preserve">I alt 220–300 timer, svarende til 220.000–300.000 kr. ekskl. moms.</w:t>
+      </w:r>
+    </w:p>
+    <w:p>
+      <w:pPr>
+        <w:spacing w:line="240" w:lineRule="auto"/>
+      </w:pPr>
+      <w:r>
+        <w:t xml:space="preserve">Hertil kommer geoteknisk undersøgelse, typisk ca. 10.000 kr. ekskl. moms, samt de tilvalg, der ønskes nedenfor.</w:t>
+      </w:r>
+    </w:p>
+    <w:p>
+      <w:pPr>
+        <w:spacing w:line="240" w:lineRule="auto"/>
+      </w:pPr>
+    </w:p>
+    <w:p>
+      <w:pPr>
+        <w:spacing w:line="240" w:lineRule="auto"/>
+        <w:rPr>
+          <w:b/>
+          <w:bCs/>
+        </w:rPr>
+      </w:pPr>
+      <w:r>
+        <w:rPr>
+          <w:b/>
+          <w:bCs/>
+        </w:rPr>
+        <w:t xml:space="preserve">Tilvalg:</w:t>
+      </w:r>
+    </w:p>
+    <w:p>
+      <w:pPr>
+        <w:spacing w:line="240" w:lineRule="auto"/>
+      </w:pPr>
+      <w:r>
+        <w:rPr>
+          <w:b/>
+          <w:bCs/>
+        </w:rPr>
+        <w:t xml:space="preserve">Energiramme og koordinering af løsninger (10–15 timer).</w:t>
+      </w:r>
+      <w:r>
+        <w:t xml:space="preserve"> Huset er og forbliver et sommerhus og er efter BR18 § 283, stk. 2 ikke omfattet af energirammen. I stedet skal klimaskærmen opfylde U-værdier og linjetab i bilag 2, tabel 4, og vinduer og glaspartier må højst udgøre 30 % af det opvarmede etageareal (§ 284). Med de store glaspartier forventes grænsen overskredet, og dokumentationen sker derfor med en varmetabsramme efter DS 418. Vi kan udarbejde varmetabsrammen og koordinere de energimæssige løsninger med konstruktionerne.</w:t>
+      </w:r>
+    </w:p>
+    <w:p>
+      <w:pPr>
+        <w:spacing w:line="240" w:lineRule="auto"/>
+      </w:pPr>
+      <w:r>
+        <w:rPr>
+          <w:b/>
+          <w:bCs/>
+        </w:rPr>
+        <w:t xml:space="preserve">Indeklimasimulering via ekstern rådgiver (tilbud indhentes).</w:t>
+      </w:r>
+      <w:r>
+        <w:t xml:space="preserve"> Termisk indeklima (§ 386) gælder også for sommerhuse, og overophedning bag de sydvestvendte glaspartier er projektets største risiko. Simuleringen af de kritiske rum udføres af en ekstern rådgiver, som vi indhenter tilbud fra og koordinerer med.</w:t>
+      </w:r>
+    </w:p>
+    <w:p>
+      <w:pPr>
+        <w:spacing w:line="240" w:lineRule="auto"/>
+      </w:pPr>
+      <w:r>
+        <w:rPr>
+          <w:b/>
+          <w:bCs/>
+        </w:rPr>
+        <w:t xml:space="preserve">Installationer (koordinering 5–10 timer).</w:t>
+      </w:r>
+      <w:r>
+        <w:t xml:space="preserve"> Installationerne koordineres via entreprenørens underentreprenører og deres input, eller via en underrådgiver på installationer, som vi indhenter tilbud fra.</w:t>
+      </w:r>
+    </w:p>
+    <w:p>
+      <w:pPr>
+        <w:spacing w:line="240" w:lineRule="auto"/>
+      </w:pPr>
+      <w:r>
+        <w:t xml:space="preserve">Med alle tilvalg bliver vores honorar 235–325 timer, svarende til 235.000–325.000 kr. ekskl. moms, plus eksterne tilbud.</w:t>
+      </w:r>
+    </w:p>
+    <w:p>
+      <w:pPr>
+        <w:spacing w:line="240" w:lineRule="auto"/>
+      </w:pPr>
+    </w:p>
+    <w:p>
+      <w:pPr>
+        <w:spacing w:line="240" w:lineRule="auto"/>
+        <w:rPr>
+          <w:b/>
+          <w:bCs/>
+        </w:rPr>
+      </w:pPr>
+      <w:r>
+        <w:rPr>
+          <w:b/>
+          <w:bCs/>
+        </w:rPr>
+        <w:t xml:space="preserve">Ikke inkluderet:</w:t>
       </w:r>
     </w:p>
     <w:p>
@@ -1048,7 +1073,7 @@
         <w:spacing w:before="0" w:after="0" w:line="276" w:lineRule="auto"/>
       </w:pPr>
       <w:r>
-        <w:t xml:space="preserve">Energiramme og vurdering af indeklima – tilbud indhentes fra energirådgiver</w:t>
+        <w:t xml:space="preserve">Geoteknisk undersøgelse (boringer og rapport), som udføres af geotekniker – typisk ca. 10.000 kr. ekskl. moms</w:t>
       </w:r>
     </w:p>
     <w:p>
@@ -1061,7 +1086,7 @@
         <w:spacing w:before="0" w:after="0" w:line="276" w:lineRule="auto"/>
       </w:pPr>
       <w:r>
-        <w:t xml:space="preserve">Tilsyn og kontrol under udførelse</w:t>
+        <w:t xml:space="preserve">Indeklimasimulering og evt. installationsrådgivning – tilbud indhentes</w:t>
       </w:r>
     </w:p>
     <w:p>
@@ -1074,7 +1099,7 @@
         <w:spacing w:before="0" w:after="0" w:line="276" w:lineRule="auto"/>
       </w:pPr>
       <w:r>
-        <w:t xml:space="preserve">Projektering af omfattende forstærkning eller understøbning, hvis besigtigelsen viser større skader</w:t>
+        <w:t xml:space="preserve">Tilsyn og kontrol under udførelse</w:t>
       </w:r>
     </w:p>
     <w:p>
@@ -1087,7 +1112,20 @@
         <w:spacing w:before="0" w:after="0" w:line="276" w:lineRule="auto"/>
       </w:pPr>
       <w:r>
-        <w:t xml:space="preserve">Myndighedskontakt, projektledelse og Be18-energiramme</w:t>
+        <w:t xml:space="preserve">Projektering af omfattende forstærkning eller understøbning, hvis forundersøgelsen viser større skader</w:t>
+      </w:r>
+    </w:p>
+    <w:p>
+      <w:pPr>
+        <w:pStyle w:val="Listeafsnit"/>
+        <w:numPr>
+          <w:ilvl w:val="0"/>
+          <w:numId w:val="8"/>
+        </w:numPr>
+        <w:spacing w:before="0" w:after="0" w:line="276" w:lineRule="auto"/>
+      </w:pPr>
+      <w:r>
+        <w:t xml:space="preserve">Myndighedskontakt og projektledelse</w:t>
       </w:r>
     </w:p>
     <w:p>

</xml_diff>